<commit_message>
Refactor KOTHA manuscript pipeline for full reproducibility
- Move study-level data from hardcoded DataFrames in run_validation.py to CSV files under data/
- Make validation and docx generation paths relative to the repo root
- Add paper_template.md and build_paper.py: all manuscript numbers, tables, and figure captions are now generated from code + data
- Add Makefile and README with one-command build instructions
- Regenerate 04_paper_rsm.md and KOTHA_Framework_RSM.docx from the new pipeline

Co-Authored-By: Tatsuki Onishi <bougtoir@gmail.com>
</commit_message>
<xml_diff>
--- a/rct-decomposition/KOTHA_Framework_RSM.docx
+++ b/rct-decomposition/KOTHA_Framework_RSM.docx
@@ -2306,6 +2306,17 @@
       </w:r>
     </w:p>
     <w:p>
+      <w:pPr>
+        <w:pStyle w:val="Heading3"/>
+      </w:pPr>
+      <w:r>
+        <w:rPr>
+          <w:color w:val="000000"/>
+        </w:rPr>
+        <w:t>Illustrative case selection</w:t>
+      </w:r>
+    </w:p>
+    <w:p>
       <w:r>
         <w:rPr>
           <w:rFonts w:ascii="Times New Roman" w:hAnsi="Times New Roman"/>
@@ -2314,6 +2325,46 @@
           <w:sz w:val="24"/>
         </w:rPr>
         <w:t>To illustrate the KOTHA Framework, we applied all three modules to two well-documented cases where observational evidence and RCT evidence diverged, and where the reasons for divergence have been extensively discussed in the literature.</w:t>
+      </w:r>
+    </w:p>
+    <w:p>
+      <w:r>
+        <w:rPr>
+          <w:rFonts w:ascii="Times New Roman" w:hAnsi="Times New Roman"/>
+          <w:b/>
+          <w:i w:val="0"/>
+          <w:sz w:val="24"/>
+        </w:rPr>
+        <w:t>Case 1: Intravenous magnesium in acute myocardial infarction (AMI)</w:t>
+      </w:r>
+      <w:r>
+        <w:rPr>
+          <w:rFonts w:ascii="Times New Roman" w:hAnsi="Times New Roman"/>
+          <w:b w:val="0"/>
+          <w:i w:val="0"/>
+          <w:sz w:val="24"/>
+        </w:rPr>
+        <w:t>. Between 1984 and 1995, multiple small RCTs suggested that intravenous magnesium reduced mortality in AMI (pooled OR approximately 0.54). The large ISIS-4 trial (N = 58,050) found no benefit (OR approximately 1.05). This discordance has been attributed to temporal changes in background therapy (introduction of thrombolysis), which reduced control-group event rates and potentially diluted the treatment effect [18, 19].</w:t>
+      </w:r>
+    </w:p>
+    <w:p>
+      <w:r>
+        <w:rPr>
+          <w:rFonts w:ascii="Times New Roman" w:hAnsi="Times New Roman"/>
+          <w:b/>
+          <w:i w:val="0"/>
+          <w:sz w:val="24"/>
+        </w:rPr>
+        <w:t>Case 2: Statins in heart failure (HF)</w:t>
+      </w:r>
+      <w:r>
+        <w:rPr>
+          <w:rFonts w:ascii="Times New Roman" w:hAnsi="Times New Roman"/>
+          <w:b w:val="0"/>
+          <w:i w:val="0"/>
+          <w:sz w:val="24"/>
+        </w:rPr>
+        <w:t>. Observational cohort studies consistently reported reduced mortality with statin use (pooled HR approximately 0.72), whereas the two largest RCTs in this population—CORONA and GISSI-HF—found no significant benefit (pooled HR approximately 0.97). This discrepancy has been attributed to differences between RCT-enrolled and real-world patient populations, with RCT participants having lower baseline risk [20, 21].</w:t>
       </w:r>
     </w:p>
     <w:p>
@@ -2324,18 +2375,7 @@
         <w:rPr>
           <w:color w:val="000000"/>
         </w:rPr>
-        <w:t>Illustrative case selection</w:t>
-      </w:r>
-    </w:p>
-    <w:p>
-      <w:r>
-        <w:rPr>
-          <w:rFonts w:ascii="Times New Roman" w:hAnsi="Times New Roman"/>
-          <w:b w:val="0"/>
-          <w:i w:val="0"/>
-          <w:sz w:val="24"/>
-        </w:rPr>
-        <w:t>We selected two cases based on the following criteria: (1) well-documented observational-RCT discordance, (2) availability of study-level data from published meta-analyses, (3) extensive prior discussion of the reasons for divergence, and (4) relevance to the structural information loss hypothesis.</w:t>
+        <w:t>Data sources</w:t>
       </w:r>
     </w:p>
     <w:p>
@@ -2346,80 +2386,7 @@
           <w:i w:val="0"/>
           <w:sz w:val="24"/>
         </w:rPr>
-        <w:t>Case 1: Intravenous magnesium in acute myocardial infarction (AMI)</w:t>
-      </w:r>
-      <w:r>
-        <w:rPr>
-          <w:rFonts w:ascii="Times New Roman" w:hAnsi="Times New Roman"/>
-          <w:b w:val="0"/>
-          <w:i w:val="0"/>
-          <w:sz w:val="24"/>
-        </w:rPr>
-        <w:t>. Between 1984 and 1995, multiple small RCTs suggested that intravenous magnesium reduced mortality in AMI (pooled OR approximately 0.54). The large ISIS-4 trial (N = 58,050) found no benefit (OR approximately 1.05). This discordance has been attributed to temporal changes in background therapy (introduction of thrombolysis), which reduced control-group event rates and potentially diluted the treatment effect [18, 19].</w:t>
-      </w:r>
-    </w:p>
-    <w:p>
-      <w:r>
-        <w:rPr>
-          <w:rFonts w:ascii="Times New Roman" w:hAnsi="Times New Roman"/>
-          <w:b/>
-          <w:i w:val="0"/>
-          <w:sz w:val="24"/>
-        </w:rPr>
-        <w:t>Case 2: Statins in heart failure (HF)</w:t>
-      </w:r>
-      <w:r>
-        <w:rPr>
-          <w:rFonts w:ascii="Times New Roman" w:hAnsi="Times New Roman"/>
-          <w:b w:val="0"/>
-          <w:i w:val="0"/>
-          <w:sz w:val="24"/>
-        </w:rPr>
-        <w:t>. Multiple large observational studies reported substantial mortality reduction with statins in HF patients (pooled HR approximately 0.72). Two large RCTs (CORONA, GISSI-HF) found no significant benefit (pooled HR approximately 0.97). The discordance has been attributed to both confounding in observational studies and selection of lower-risk RCT populations [20, 21, 22].</w:t>
-      </w:r>
-    </w:p>
-    <w:p>
-      <w:pPr>
-        <w:pStyle w:val="Heading3"/>
-      </w:pPr>
-      <w:r>
-        <w:rPr>
-          <w:color w:val="000000"/>
-        </w:rPr>
-        <w:t>Data sources</w:t>
-      </w:r>
-    </w:p>
-    <w:p>
-      <w:pPr>
-        <w:pStyle w:val="Heading4"/>
-      </w:pPr>
-      <w:r>
-        <w:rPr>
-          <w:color w:val="000000"/>
-        </w:rPr>
-        <w:t>Case 1: Magnesium in AMI</w:t>
-      </w:r>
-    </w:p>
-    <w:p>
-      <w:r>
-        <w:rPr>
-          <w:rFonts w:ascii="Times New Roman" w:hAnsi="Times New Roman"/>
-          <w:b w:val="0"/>
-          <w:i w:val="0"/>
-          <w:sz w:val="24"/>
-        </w:rPr>
-        <w:t>Study-level data were extracted from published meta-analyses [18, 19] for 12 trials (Table 3). Trials were classified by era: pre-thrombolysis (1984–1990, 7 trials), transition (1991, 2 trials), and thrombolysis (1992–1995, 3 trials including ISIS-4).</w:t>
-      </w:r>
-    </w:p>
-    <w:p>
-      <w:r>
-        <w:rPr>
-          <w:rFonts w:ascii="Times New Roman" w:hAnsi="Times New Roman"/>
-          <w:b/>
-          <w:i w:val="0"/>
-          <w:sz w:val="24"/>
-        </w:rPr>
-        <w:t>Table 3: Magnesium in AMI --- study-level data</w:t>
+        <w:t>Table 3: Study-level data for magnesium in AMI</w:t>
       </w:r>
     </w:p>
     <w:tbl>
@@ -3968,7 +3935,7 @@
                 <w:rFonts w:ascii="Times New Roman" w:hAnsi="Times New Roman"/>
                 <w:sz w:val="20"/>
               </w:rPr>
-              <w:t>2,216</w:t>
+              <w:t>2216</w:t>
             </w:r>
           </w:p>
         </w:tc>
@@ -3998,7 +3965,7 @@
                 <w:rFonts w:ascii="Times New Roman" w:hAnsi="Times New Roman"/>
                 <w:sz w:val="20"/>
               </w:rPr>
-              <w:t>2,103</w:t>
+              <w:t>2103</w:t>
             </w:r>
           </w:p>
         </w:tc>
@@ -4035,28 +4002,6 @@
       </w:tr>
     </w:tbl>
     <w:p>
-      <w:pPr>
-        <w:pStyle w:val="Heading4"/>
-      </w:pPr>
-      <w:r>
-        <w:rPr>
-          <w:color w:val="000000"/>
-        </w:rPr>
-        <w:t>Case 2: Statins in heart failure</w:t>
-      </w:r>
-    </w:p>
-    <w:p>
-      <w:r>
-        <w:rPr>
-          <w:rFonts w:ascii="Times New Roman" w:hAnsi="Times New Roman"/>
-          <w:b w:val="0"/>
-          <w:i w:val="0"/>
-          <w:sz w:val="24"/>
-        </w:rPr>
-        <w:t>Observational study data were extracted from five published cohort studies [20, 23, 24, 25, 26]. RCT data were from CORONA [21] and GISSI-HF [22] (Table 4).</w:t>
-      </w:r>
-    </w:p>
-    <w:p>
       <w:r>
         <w:rPr>
           <w:rFonts w:ascii="Times New Roman" w:hAnsi="Times New Roman"/>
@@ -4064,7 +4009,7 @@
           <w:i w:val="0"/>
           <w:sz w:val="24"/>
         </w:rPr>
-        <w:t>Table 4: Statins in HF --- study-level data</w:t>
+        <w:t>Table 4: Study-level data for statins in heart failure</w:t>
       </w:r>
     </w:p>
     <w:tbl>
@@ -4722,7 +4667,7 @@
         <w:rPr>
           <w:color w:val="000000"/>
         </w:rPr>
-        <w:t>Case 1: Magnesium in AMI</w:t>
+        <w:t>Magnesium in AMI</w:t>
       </w:r>
     </w:p>
     <w:p>
@@ -4733,7 +4678,7 @@
           <w:i w:val="0"/>
           <w:sz w:val="24"/>
         </w:rPr>
-        <w:t>Odds ratios and standard errors were computed for each trial using the Peto method with continuity correction. DerSimonian-Laird random-effects meta-analysis yielded:</w:t>
+        <w:t>Control-group event rates were computed for each era:</w:t>
       </w:r>
     </w:p>
     <w:p>
@@ -4743,20 +4688,11 @@
       <w:r>
         <w:rPr>
           <w:rFonts w:ascii="Times New Roman" w:hAnsi="Times New Roman"/>
-          <w:b/>
-          <w:i w:val="0"/>
-          <w:sz w:val="24"/>
-        </w:rPr>
-        <w:t>Pre-ISIS-4 trials</w:t>
-      </w:r>
-      <w:r>
-        <w:rPr>
-          <w:rFonts w:ascii="Times New Roman" w:hAnsi="Times New Roman"/>
           <w:b w:val="0"/>
           <w:i w:val="0"/>
           <w:sz w:val="24"/>
         </w:rPr>
-        <w:t xml:space="preserve"> (11 trials): OR = 0.54 (95% CI: 0.40–0.75), I^2 = 6%</w:t>
+        <w:t>Pre-thrombolysis era (1984–1990): weighted mean = 8.9%</w:t>
       </w:r>
     </w:p>
     <w:p>
@@ -4766,31 +4702,11 @@
       <w:r>
         <w:rPr>
           <w:rFonts w:ascii="Times New Roman" w:hAnsi="Times New Roman"/>
-          <w:b/>
-          <w:i w:val="0"/>
-          <w:sz w:val="24"/>
-        </w:rPr>
-        <w:t>All trials</w:t>
-      </w:r>
-      <w:r>
-        <w:rPr>
-          <w:rFonts w:ascii="Times New Roman" w:hAnsi="Times New Roman"/>
           <w:b w:val="0"/>
           <w:i w:val="0"/>
           <w:sz w:val="24"/>
         </w:rPr>
-        <w:t xml:space="preserve"> (12 trials): OR = 0.56 (95% CI: 0.38–0.83), I^2 = 62%</w:t>
-      </w:r>
-    </w:p>
-    <w:p>
-      <w:r>
-        <w:rPr>
-          <w:rFonts w:ascii="Times New Roman" w:hAnsi="Times New Roman"/>
-          <w:b w:val="0"/>
-          <w:i w:val="0"/>
-          <w:sz w:val="24"/>
-        </w:rPr>
-        <w:t>Control-group event rates were computed for each era:</w:t>
+        <w:t>ISIS-4 (1995): 7.2%</w:t>
       </w:r>
     </w:p>
     <w:p>
@@ -4804,7 +4720,29 @@
           <w:i w:val="0"/>
           <w:sz w:val="24"/>
         </w:rPr>
-        <w:t>Pre-thrombolysis era (1984–1990): weighted mean = 8.9%</w:t>
+        <w:t>LIMIT-2 (1992): 10.2%</w:t>
+      </w:r>
+    </w:p>
+    <w:p>
+      <w:r>
+        <w:rPr>
+          <w:rFonts w:ascii="Times New Roman" w:hAnsi="Times New Roman"/>
+          <w:b w:val="0"/>
+          <w:i w:val="0"/>
+          <w:sz w:val="24"/>
+        </w:rPr>
+        <w:t>The event rate ratio (ISIS-4 / pre-thrombolysis) was 0.82, indicating a 18% reduction in control event rates in the thrombolysis era (Fig. 2).</w:t>
+      </w:r>
+    </w:p>
+    <w:p>
+      <w:r>
+        <w:rPr>
+          <w:rFonts w:ascii="Times New Roman" w:hAnsi="Times New Roman"/>
+          <w:b w:val="0"/>
+          <w:i w:val="0"/>
+          <w:sz w:val="24"/>
+        </w:rPr>
+        <w:t>Random-effects meta-analysis yielded:</w:t>
       </w:r>
     </w:p>
     <w:p>
@@ -4814,11 +4752,20 @@
       <w:r>
         <w:rPr>
           <w:rFonts w:ascii="Times New Roman" w:hAnsi="Times New Roman"/>
+          <w:b/>
+          <w:i w:val="0"/>
+          <w:sz w:val="24"/>
+        </w:rPr>
+        <w:t>Pre-ISIS-4 trials</w:t>
+      </w:r>
+      <w:r>
+        <w:rPr>
+          <w:rFonts w:ascii="Times New Roman" w:hAnsi="Times New Roman"/>
           <w:b w:val="0"/>
           <w:i w:val="0"/>
           <w:sz w:val="24"/>
         </w:rPr>
-        <w:t>ISIS-4 (1995): 7.2%</w:t>
+        <w:t xml:space="preserve"> (11 trials): OR = 0.54 (95% CI: 0.40–0.75), I^2 = 6%</w:t>
       </w:r>
     </w:p>
     <w:p>
@@ -4828,14 +4775,12 @@
       <w:r>
         <w:rPr>
           <w:rFonts w:ascii="Times New Roman" w:hAnsi="Times New Roman"/>
-          <w:b w:val="0"/>
+          <w:b/>
           <w:i w:val="0"/>
           <w:sz w:val="24"/>
         </w:rPr>
-        <w:t>LIMIT-2 (1992): 10.2%</w:t>
-      </w:r>
-    </w:p>
-    <w:p>
+        <w:t>All trials</w:t>
+      </w:r>
       <w:r>
         <w:rPr>
           <w:rFonts w:ascii="Times New Roman" w:hAnsi="Times New Roman"/>
@@ -4843,7 +4788,7 @@
           <w:i w:val="0"/>
           <w:sz w:val="24"/>
         </w:rPr>
-        <w:t>The event rate ratio (ISIS-4 / pre-thrombolysis) was 0.82, indicating an 18% reduction in control event rates in the thrombolysis era (Fig. 2).</w:t>
+        <w:t xml:space="preserve"> (12 trials): OR = 0.56 (95% CI: 0.38–0.83), I^2 = 62%</w:t>
       </w:r>
     </w:p>
     <w:p>
@@ -4854,7 +4799,7 @@
           <w:i w:val="0"/>
           <w:sz w:val="24"/>
         </w:rPr>
-        <w:t>Power analysis at the ISIS-4 sample size (N = 58,050) showed that for the pre-ISIS-4 pooled effect (OR = 0.54), power exceeded 99% under all scenarios — the ISIS-4 trial was sufficiently large to detect an effect of this magnitude regardless of event rate. However, for more modest effects (OR = 0.85–0.95), the event rate reduction produced meaningful power differences between scenarios (Fig. 3A). At OR = 0.90, power was 95.8% under the pre-thrombolysis rate (S1) but 91.5% under the ISIS-4 rate (S2).</w:t>
+        <w:t>Power analysis at the ISIS-4 sample size (N = 58,050) showed that for the pre-ISIS-4 pooled effect (OR = 0.54), power exceeded 99% under all scenarios—the ISIS-4 trial was sufficiently large to detect an effect of this magnitude regardless of event rate. However, for more modest effects (OR = 0.85–0.95), the event rate reduction produced meaningful power differences between scenarios (Fig. 3A). At OR = 0.90, power was 95.8% under the pre-thrombolysis rate (S1) but 91.5% under the ISIS-4 rate (S2).</w:t>
       </w:r>
     </w:p>
     <w:p>
@@ -4865,7 +4810,7 @@
         <w:rPr>
           <w:color w:val="000000"/>
         </w:rPr>
-        <w:t>Case 2: Statins in HF</w:t>
+        <w:t>Statins in heart failure</w:t>
       </w:r>
     </w:p>
     <w:p>
@@ -4944,7 +4889,7 @@
           <w:i w:val="0"/>
           <w:sz w:val="24"/>
         </w:rPr>
-        <w:t>Power analysis at the combined RCT sample size (N = 9,585) revealed substantial power differences (Fig. 3B). At the observational effect estimate (HR = 0.72), power was &gt;99% under the observational event rate (15%) but 99.1% under the RCT rate (8%). At more modest effects (HR = 0.85), power was 84.6% under the observational rate but only 58.3% under the RCT rate — a 26 percentage-point reduction attributable to event dilution.</w:t>
+        <w:t>Power analysis at the combined RCT sample size (N = 9,585) revealed substantial power differences (Fig. 3B). At the observational effect estimate (HR = 0.72), power was &gt;99% under the observational event rate (15%) but 99.1% under the RCT event rate (8%). At more modest effects (HR = 0.85), power was 84.6% under the observational rate but only 58.3% under the RCT rate—a 26 percentage-point reduction attributable to event dilution.</w:t>
       </w:r>
     </w:p>
     <w:p>
@@ -4966,18 +4911,7 @@
         <w:rPr>
           <w:color w:val="000000"/>
         </w:rPr>
-        <w:t>Case 1: Magnesium in AMI</w:t>
-      </w:r>
-    </w:p>
-    <w:p>
-      <w:r>
-        <w:rPr>
-          <w:rFonts w:ascii="Times New Roman" w:hAnsi="Times New Roman"/>
-          <w:b w:val="0"/>
-          <w:i w:val="0"/>
-          <w:sz w:val="24"/>
-        </w:rPr>
-        <w:t>Power prior analysis treated the 11 pre-ISIS-4 trials as prior evidence and ISIS-4 as the primary RCT evidence. Table 5 presents results across the discounting grid, with the full forest plot in Fig. 4.</w:t>
+        <w:t>Bayesian integration --- Magnesium in AMI</w:t>
       </w:r>
     </w:p>
     <w:p>
@@ -5159,7 +5093,7 @@
                 <w:rFonts w:ascii="Times New Roman" w:hAnsi="Times New Roman"/>
                 <w:sz w:val="20"/>
               </w:rPr>
-              <w:t>16.3%</w:t>
+              <w:t>16.2%</w:t>
             </w:r>
           </w:p>
         </w:tc>
@@ -5236,7 +5170,7 @@
                 <w:rFonts w:ascii="Times New Roman" w:hAnsi="Times New Roman"/>
                 <w:sz w:val="20"/>
               </w:rPr>
-              <w:t>27.2%</w:t>
+              <w:t>27.9%</w:t>
             </w:r>
           </w:p>
         </w:tc>
@@ -5313,7 +5247,7 @@
                 <w:rFonts w:ascii="Times New Roman" w:hAnsi="Times New Roman"/>
                 <w:sz w:val="20"/>
               </w:rPr>
-              <w:t>43.3%</w:t>
+              <w:t>45.8%</w:t>
             </w:r>
           </w:p>
         </w:tc>
@@ -5390,7 +5324,7 @@
                 <w:rFonts w:ascii="Times New Roman" w:hAnsi="Times New Roman"/>
                 <w:sz w:val="20"/>
               </w:rPr>
-              <w:t>55.3%</w:t>
+              <w:t>56.9%</w:t>
             </w:r>
           </w:p>
         </w:tc>
@@ -5467,7 +5401,7 @@
                 <w:rFonts w:ascii="Times New Roman" w:hAnsi="Times New Roman"/>
                 <w:sz w:val="20"/>
               </w:rPr>
-              <w:t>78.2%</w:t>
+              <w:t>77.1%</w:t>
             </w:r>
           </w:p>
         </w:tc>
@@ -5544,7 +5478,7 @@
                 <w:rFonts w:ascii="Times New Roman" w:hAnsi="Times New Roman"/>
                 <w:sz w:val="20"/>
               </w:rPr>
-              <w:t>87.2%</w:t>
+              <w:t>87.4%</w:t>
             </w:r>
           </w:p>
         </w:tc>
@@ -5621,7 +5555,7 @@
                 <w:rFonts w:ascii="Times New Roman" w:hAnsi="Times New Roman"/>
                 <w:sz w:val="20"/>
               </w:rPr>
-              <w:t>92.8%</w:t>
+              <w:t>93.5%</w:t>
             </w:r>
           </w:p>
         </w:tc>
@@ -5646,18 +5580,7 @@
         <w:rPr>
           <w:color w:val="000000"/>
         </w:rPr>
-        <w:t>Case 2: Statins in HF</w:t>
-      </w:r>
-    </w:p>
-    <w:p>
-      <w:r>
-        <w:rPr>
-          <w:rFonts w:ascii="Times New Roman" w:hAnsi="Times New Roman"/>
-          <w:b w:val="0"/>
-          <w:i w:val="0"/>
-          <w:sz w:val="24"/>
-        </w:rPr>
-        <w:t>Power prior analysis treated observational studies as prior evidence and the two RCTs as primary evidence. Table 6 presents results, with the full forest plot in Fig. 6.</w:t>
+        <w:t>Bayesian integration --- Statins in HF</w:t>
       </w:r>
     </w:p>
     <w:p>
@@ -5839,7 +5762,7 @@
                 <w:rFonts w:ascii="Times New Roman" w:hAnsi="Times New Roman"/>
                 <w:sz w:val="20"/>
               </w:rPr>
-              <w:t>5.3%</w:t>
+              <w:t>9.1%</w:t>
             </w:r>
           </w:p>
         </w:tc>
@@ -5916,7 +5839,7 @@
                 <w:rFonts w:ascii="Times New Roman" w:hAnsi="Times New Roman"/>
                 <w:sz w:val="20"/>
               </w:rPr>
-              <w:t>20.2%</w:t>
+              <w:t>17.7%</w:t>
             </w:r>
           </w:p>
         </w:tc>
@@ -5993,7 +5916,7 @@
                 <w:rFonts w:ascii="Times New Roman" w:hAnsi="Times New Roman"/>
                 <w:sz w:val="20"/>
               </w:rPr>
-              <w:t>32.6%</w:t>
+              <w:t>26.0%</w:t>
             </w:r>
           </w:p>
         </w:tc>
@@ -6070,7 +5993,7 @@
                 <w:rFonts w:ascii="Times New Roman" w:hAnsi="Times New Roman"/>
                 <w:sz w:val="20"/>
               </w:rPr>
-              <w:t>42.0%</w:t>
+              <w:t>32.8%</w:t>
             </w:r>
           </w:p>
         </w:tc>
@@ -6147,7 +6070,7 @@
                 <w:rFonts w:ascii="Times New Roman" w:hAnsi="Times New Roman"/>
                 <w:sz w:val="20"/>
               </w:rPr>
-              <w:t>56.5%</w:t>
+              <w:t>42.5%</w:t>
             </w:r>
           </w:p>
         </w:tc>
@@ -6224,7 +6147,7 @@
                 <w:rFonts w:ascii="Times New Roman" w:hAnsi="Times New Roman"/>
                 <w:sz w:val="20"/>
               </w:rPr>
-              <w:t>68.0%</w:t>
+              <w:t>53.4%</w:t>
             </w:r>
           </w:p>
         </w:tc>
@@ -6301,7 +6224,7 @@
                 <w:rFonts w:ascii="Times New Roman" w:hAnsi="Times New Roman"/>
                 <w:sz w:val="20"/>
               </w:rPr>
-              <w:t>79.3%</w:t>
+              <w:t>64.1%</w:t>
             </w:r>
           </w:p>
         </w:tc>
@@ -6337,7 +6260,7 @@
         <w:rPr>
           <w:color w:val="000000"/>
         </w:rPr>
-        <w:t>Case 1: Magnesium in AMI</w:t>
+        <w:t>Magnesium in AMI</w:t>
       </w:r>
     </w:p>
     <w:p>
@@ -6357,7 +6280,7 @@
           <w:i w:val="0"/>
           <w:sz w:val="24"/>
         </w:rPr>
-        <w:t>: The OIS for detecting OR = 0.54 at \alpha = 0.05 with 80% power was 85 events. The total events across all 12 trials were 4,617 (information fraction = 5,426%). By this criterion, the meta-analysis was informationally sufficient. However, this assessment assumes the pre-ISIS-4 effect estimate is the true effect; if the true effect is more modest (e.g., OR = 0.75), the OIS would be 379 events, still exceeded by the available evidence.</w:t>
+        <w:t>: The OIS for detecting OR = 0.54 at \alpha = 0.05 with 80% power was 85 events. The total events across all 12 trials were 4,617 (information fraction = 5426%). By this criterion, the meta-analysis was informationally sufficient. However, this assessment assumes the pre-ISIS-4 effect estimate is the true effect; if the true effect is more modest (e.g., OR = 0.75), the OIS would be 379 events, still exceeded by the available evidence.</w:t>
       </w:r>
     </w:p>
     <w:p>
@@ -6417,7 +6340,7 @@
           <w:i w:val="0"/>
           <w:sz w:val="24"/>
         </w:rPr>
-        <w:t>: We present the cumulative Z-curve using both fixed-effect and random-effects accumulation because the two models give different results in this case. Under a fixed-effect accumulation, the Z-statistic reached significance after the early small trials but was pulled back to 0.80 by ISIS-4 (below the conventional boundary of 1.96). Under a random-effects accumulation—the same model used for the pooled all-trials estimate—the final Z was -2.90, crossing both the conventional boundary and the O'Brien-Fleming boundary. This divergence is a direct consequence of the high between-study heterogeneity (I^2 = 62%) driven by the ISIS-4 result; it underscores that the magnesium evidence base contains a genuine shift in treatment effect across eras and should not be summarized by a single pooled estimate.</w:t>
+        <w:t>: We present the cumulative Z-curve using both fixed-effect and random-effects accumulation because the two models give different results in this case. Under a fixed-effect accumulation, the Z-statistic reached significance after the early small trials but was pulled back to 0.80 by ISIS-4 (below the conventional boundary of 1.96). Under a random-effects accumulation—the same model used for the pooled all-trials estimate—the final Z was -2.90, crossing both the conventional boundary and the O'Brien-Fleming boundary (0.27). This divergence is a direct consequence of the high between-study heterogeneity (I^2 = 62%) driven by the ISIS-4 result; it underscores that the magnesium evidence base contains a genuine shift in treatment effect across eras and should not be summarized by a single pooled estimate.</w:t>
       </w:r>
     </w:p>
     <w:p>
@@ -6428,7 +6351,7 @@
         <w:rPr>
           <w:color w:val="000000"/>
         </w:rPr>
-        <w:t>Case 2: Statins in HF</w:t>
+        <w:t>Statins in heart failure</w:t>
       </w:r>
     </w:p>
     <w:p>
@@ -7198,7 +7121,7 @@
           <w:i w:val="0"/>
           <w:sz w:val="24"/>
         </w:rPr>
-        <w:t>The KOTHA Framework was illustrated using two canonical cases of observational-RCT divergence. In both cases, the framework identified structural features — temporal event dilution (magnesium) and population risk-profile differences (statins) — that contributed to the apparent discordance between observational and RCT evidence.</w:t>
+        <w:t>The KOTHA Framework was illustrated using two canonical cases of observational-RCT divergence. In both cases, the framework identified structural features—temporal event dilution (magnesium) and population risk-profile differences (statins)—that contributed to the apparent discordance between observational and RCT evidence.</w:t>
       </w:r>
     </w:p>
     <w:p>

</xml_diff>

<commit_message>
regenerate CCTC/RSM/generic outputs and submission package with reproducible emcee
Co-Authored-By: Tatsuki Onishi <bougtoir@gmail.com>
</commit_message>
<xml_diff>
--- a/rct-decomposition/KOTHA_Framework_RSM.docx
+++ b/rct-decomposition/KOTHA_Framework_RSM.docx
@@ -112,7 +112,7 @@
           <w:i w:val="0"/>
           <w:sz w:val="24"/>
         </w:rPr>
-        <w:t>: In the magnesium case, control event rates declined from 8.9% (pre-thrombolysis era) to 7.2% (ISIS-4), reflecting temporal event dilution. The pre-ISIS-4 meta-analysis yielded OR = 0.54 (95% CI: 0.40–0.75), while the all-trials estimate was OR = 0.56 (0.38–0.83) with I^2 = 62%. Bayesian integration with power prior discounting (\alpha = 0.3) yielded OR = 0.74 (95% CrI: 0.24–1.32), P(OR &lt; 1) = 83%. In the statins case, observational studies showed HR = 0.72 (0.64–0.80) while RCTs showed HR = 0.97 (0.90–1.05), with event rate ratio of 0.53 (RCT/observational). Module H classified magnesium as inconclusive with serious inconsistency (heterogeneity) and statins as inconclusive with serious indirectness, whereas standard GRADE evaluation would be more likely to conclude "no benefit demonstrated."</w:t>
+        <w:t>: In the magnesium case, control event rates declined from 8.9% (pre-thrombolysis era) to 7.2% (ISIS-4), reflecting temporal event dilution. The pre-ISIS-4 meta-analysis yielded OR = 0.54 (95% CI: 0.40–0.75), while the all-trials estimate was OR = 0.56 (0.38–0.83) with I^2 = 62%. Bayesian integration with power prior discounting (\alpha = 0.3) yielded OR = 0.74 (95% CrI: 0.25–1.43), P(OR &lt; 1) = 81%. In the statins case, observational studies showed HR = 0.72 (0.64–0.80) while RCTs showed HR = 0.97 (0.90–1.05), with event rate ratio of 0.53 (RCT/observational). Module H classified magnesium as inconclusive with serious inconsistency (heterogeneity) and statins as inconclusive with serious indirectness, whereas standard GRADE evaluation would be more likely to conclude "no benefit demonstrated."</w:t>
       </w:r>
     </w:p>
     <w:p>
@@ -5048,7 +5048,7 @@
                 <w:rFonts w:ascii="Times New Roman" w:hAnsi="Times New Roman"/>
                 <w:sz w:val="20"/>
               </w:rPr>
-              <w:t>1.07 (0.06–16.87)</w:t>
+              <w:t>1.05 (0.03–27.97)</w:t>
             </w:r>
           </w:p>
         </w:tc>
@@ -5063,7 +5063,7 @@
                 <w:rFonts w:ascii="Times New Roman" w:hAnsi="Times New Roman"/>
                 <w:sz w:val="20"/>
               </w:rPr>
-              <w:t>39.3%</w:t>
+              <w:t>42.8%</w:t>
             </w:r>
           </w:p>
         </w:tc>
@@ -5078,7 +5078,7 @@
                 <w:rFonts w:ascii="Times New Roman" w:hAnsi="Times New Roman"/>
                 <w:sz w:val="20"/>
               </w:rPr>
-              <w:t>29.4%</w:t>
+              <w:t>33.4%</w:t>
             </w:r>
           </w:p>
         </w:tc>
@@ -5093,7 +5093,7 @@
                 <w:rFonts w:ascii="Times New Roman" w:hAnsi="Times New Roman"/>
                 <w:sz w:val="20"/>
               </w:rPr>
-              <w:t>23.0%</w:t>
+              <w:t>27.0%</w:t>
             </w:r>
           </w:p>
         </w:tc>
@@ -5125,7 +5125,7 @@
                 <w:rFonts w:ascii="Times New Roman" w:hAnsi="Times New Roman"/>
                 <w:sz w:val="20"/>
               </w:rPr>
-              <w:t>0.94 (0.15–2.74)</w:t>
+              <w:t>0.93 (0.15–2.92)</w:t>
             </w:r>
           </w:p>
         </w:tc>
@@ -5140,7 +5140,7 @@
                 <w:rFonts w:ascii="Times New Roman" w:hAnsi="Times New Roman"/>
                 <w:sz w:val="20"/>
               </w:rPr>
-              <w:t>58.5%</w:t>
+              <w:t>58.3%</w:t>
             </w:r>
           </w:p>
         </w:tc>
@@ -5155,7 +5155,7 @@
                 <w:rFonts w:ascii="Times New Roman" w:hAnsi="Times New Roman"/>
                 <w:sz w:val="20"/>
               </w:rPr>
-              <w:t>45.8%</w:t>
+              <w:t>46.3%</w:t>
             </w:r>
           </w:p>
         </w:tc>
@@ -5170,7 +5170,7 @@
                 <w:rFonts w:ascii="Times New Roman" w:hAnsi="Times New Roman"/>
                 <w:sz w:val="20"/>
               </w:rPr>
-              <w:t>35.6%</w:t>
+              <w:t>36.2%</w:t>
             </w:r>
           </w:p>
         </w:tc>
@@ -5202,7 +5202,7 @@
                 <w:rFonts w:ascii="Times New Roman" w:hAnsi="Times New Roman"/>
                 <w:sz w:val="20"/>
               </w:rPr>
-              <w:t>0.82 (0.22–1.75)</w:t>
+              <w:t>0.83 (0.22–1.75)</w:t>
             </w:r>
           </w:p>
         </w:tc>
@@ -5217,7 +5217,7 @@
                 <w:rFonts w:ascii="Times New Roman" w:hAnsi="Times New Roman"/>
                 <w:sz w:val="20"/>
               </w:rPr>
-              <w:t>72.3%</w:t>
+              <w:t>71.4%</w:t>
             </w:r>
           </w:p>
         </w:tc>
@@ -5232,7 +5232,7 @@
                 <w:rFonts w:ascii="Times New Roman" w:hAnsi="Times New Roman"/>
                 <w:sz w:val="20"/>
               </w:rPr>
-              <w:t>59.9%</w:t>
+              <w:t>58.9%</w:t>
             </w:r>
           </w:p>
         </w:tc>
@@ -5247,7 +5247,7 @@
                 <w:rFonts w:ascii="Times New Roman" w:hAnsi="Times New Roman"/>
                 <w:sz w:val="20"/>
               </w:rPr>
-              <w:t>47.4%</w:t>
+              <w:t>46.9%</w:t>
             </w:r>
           </w:p>
         </w:tc>
@@ -5279,7 +5279,7 @@
                 <w:rFonts w:ascii="Times New Roman" w:hAnsi="Times New Roman"/>
                 <w:sz w:val="20"/>
               </w:rPr>
-              <w:t>0.74 (0.24–1.32)</w:t>
+              <w:t>0.74 (0.25–1.43)</w:t>
             </w:r>
           </w:p>
         </w:tc>
@@ -5294,7 +5294,7 @@
                 <w:rFonts w:ascii="Times New Roman" w:hAnsi="Times New Roman"/>
                 <w:sz w:val="20"/>
               </w:rPr>
-              <w:t>83.2%</w:t>
+              <w:t>80.7%</w:t>
             </w:r>
           </w:p>
         </w:tc>
@@ -5309,7 +5309,7 @@
                 <w:rFonts w:ascii="Times New Roman" w:hAnsi="Times New Roman"/>
                 <w:sz w:val="20"/>
               </w:rPr>
-              <w:t>71.9%</w:t>
+              <w:t>69.6%</w:t>
             </w:r>
           </w:p>
         </w:tc>
@@ -5324,7 +5324,7 @@
                 <w:rFonts w:ascii="Times New Roman" w:hAnsi="Times New Roman"/>
                 <w:sz w:val="20"/>
               </w:rPr>
-              <w:t>59.2%</w:t>
+              <w:t>57.4%</w:t>
             </w:r>
           </w:p>
         </w:tc>
@@ -5356,7 +5356,7 @@
                 <w:rFonts w:ascii="Times New Roman" w:hAnsi="Times New Roman"/>
                 <w:sz w:val="20"/>
               </w:rPr>
-              <w:t>0.64 (0.28–1.09)</w:t>
+              <w:t>0.63 (0.28–1.10)</w:t>
             </w:r>
           </w:p>
         </w:tc>
@@ -5371,7 +5371,7 @@
                 <w:rFonts w:ascii="Times New Roman" w:hAnsi="Times New Roman"/>
                 <w:sz w:val="20"/>
               </w:rPr>
-              <w:t>93.9%</w:t>
+              <w:t>94.0%</w:t>
             </w:r>
           </w:p>
         </w:tc>
@@ -5386,7 +5386,7 @@
                 <w:rFonts w:ascii="Times New Roman" w:hAnsi="Times New Roman"/>
                 <w:sz w:val="20"/>
               </w:rPr>
-              <w:t>86.8%</w:t>
+              <w:t>87.2%</w:t>
             </w:r>
           </w:p>
         </w:tc>
@@ -5401,7 +5401,7 @@
                 <w:rFonts w:ascii="Times New Roman" w:hAnsi="Times New Roman"/>
                 <w:sz w:val="20"/>
               </w:rPr>
-              <w:t>75.6%</w:t>
+              <w:t>76.3%</w:t>
             </w:r>
           </w:p>
         </w:tc>
@@ -5433,7 +5433,7 @@
                 <w:rFonts w:ascii="Times New Roman" w:hAnsi="Times New Roman"/>
                 <w:sz w:val="20"/>
               </w:rPr>
-              <w:t>0.59 (0.29–0.97)</w:t>
+              <w:t>0.59 (0.29–0.98)</w:t>
             </w:r>
           </w:p>
         </w:tc>
@@ -5448,7 +5448,7 @@
                 <w:rFonts w:ascii="Times New Roman" w:hAnsi="Times New Roman"/>
                 <w:sz w:val="20"/>
               </w:rPr>
-              <w:t>98.3%</w:t>
+              <w:t>98.1%</w:t>
             </w:r>
           </w:p>
         </w:tc>
@@ -5463,7 +5463,7 @@
                 <w:rFonts w:ascii="Times New Roman" w:hAnsi="Times New Roman"/>
                 <w:sz w:val="20"/>
               </w:rPr>
-              <w:t>94.9%</w:t>
+              <w:t>94.8%</w:t>
             </w:r>
           </w:p>
         </w:tc>
@@ -5478,7 +5478,7 @@
                 <w:rFonts w:ascii="Times New Roman" w:hAnsi="Times New Roman"/>
                 <w:sz w:val="20"/>
               </w:rPr>
-              <w:t>86.8%</w:t>
+              <w:t>87.1%</w:t>
             </w:r>
           </w:p>
         </w:tc>
@@ -5510,7 +5510,7 @@
                 <w:rFonts w:ascii="Times New Roman" w:hAnsi="Times New Roman"/>
                 <w:sz w:val="20"/>
               </w:rPr>
-              <w:t>0.56 (0.31–0.86)</w:t>
+              <w:t>0.55 (0.32–0.87)</w:t>
             </w:r>
           </w:p>
         </w:tc>
@@ -5540,7 +5540,7 @@
                 <w:rFonts w:ascii="Times New Roman" w:hAnsi="Times New Roman"/>
                 <w:sz w:val="20"/>
               </w:rPr>
-              <w:t>98.5%</w:t>
+              <w:t>98.4%</w:t>
             </w:r>
           </w:p>
         </w:tc>
@@ -5555,7 +5555,7 @@
                 <w:rFonts w:ascii="Times New Roman" w:hAnsi="Times New Roman"/>
                 <w:sz w:val="20"/>
               </w:rPr>
-              <w:t>94.5%</w:t>
+              <w:t>94.4%</w:t>
             </w:r>
           </w:p>
         </w:tc>
@@ -5569,7 +5569,7 @@
           <w:i w:val="0"/>
           <w:sz w:val="24"/>
         </w:rPr>
-        <w:t>At \alpha = 0 (ISIS-4 only), the posterior median OR was 1.07 with only 39.3% probability of benefit. As \alpha increased, incorporating pre-ISIS-4 evidence progressively shifted the posterior toward benefit. At \alpha = 0.3 (moderate discounting), the posterior OR was 0.74 with 83% probability of benefit. The sensitivity analysis demonstrates that conclusions about magnesium efficacy depend critically on the weight assigned to pre-ISIS-4 evidence (Fig. 5A).</w:t>
+        <w:t>At \alpha = 0 (ISIS-4 only), the posterior median OR was 1.05 with only 42.8% probability of benefit. As \alpha increased, incorporating pre-ISIS-4 evidence progressively shifted the posterior toward benefit. At \alpha = 0.3 (moderate discounting), the posterior OR was 0.74 with 81% probability of benefit. The sensitivity analysis demonstrates that conclusions about magnesium efficacy depend critically on the weight assigned to pre-ISIS-4 evidence (Fig. 5A).</w:t>
       </w:r>
     </w:p>
     <w:p>
@@ -5717,7 +5717,7 @@
                 <w:rFonts w:ascii="Times New Roman" w:hAnsi="Times New Roman"/>
                 <w:sz w:val="20"/>
               </w:rPr>
-              <w:t>0.97 (0.54–1.64)</w:t>
+              <w:t>0.97 (0.58–1.65)</w:t>
             </w:r>
           </w:p>
         </w:tc>
@@ -5732,7 +5732,7 @@
                 <w:rFonts w:ascii="Times New Roman" w:hAnsi="Times New Roman"/>
                 <w:sz w:val="20"/>
               </w:rPr>
-              <w:t>62.7%</w:t>
+              <w:t>62.9%</w:t>
             </w:r>
           </w:p>
         </w:tc>
@@ -5747,7 +5747,7 @@
                 <w:rFonts w:ascii="Times New Roman" w:hAnsi="Times New Roman"/>
                 <w:sz w:val="20"/>
               </w:rPr>
-              <w:t>21.1%</w:t>
+              <w:t>21.2%</w:t>
             </w:r>
           </w:p>
         </w:tc>
@@ -5762,7 +5762,7 @@
                 <w:rFonts w:ascii="Times New Roman" w:hAnsi="Times New Roman"/>
                 <w:sz w:val="20"/>
               </w:rPr>
-              <w:t>9.5%</w:t>
+              <w:t>8.9%</w:t>
             </w:r>
           </w:p>
         </w:tc>
@@ -5794,7 +5794,7 @@
                 <w:rFonts w:ascii="Times New Roman" w:hAnsi="Times New Roman"/>
                 <w:sz w:val="20"/>
               </w:rPr>
-              <w:t>0.92 (0.52–1.60)</w:t>
+              <w:t>0.92 (0.53–1.64)</w:t>
             </w:r>
           </w:p>
         </w:tc>
@@ -5809,7 +5809,7 @@
                 <w:rFonts w:ascii="Times New Roman" w:hAnsi="Times New Roman"/>
                 <w:sz w:val="20"/>
               </w:rPr>
-              <w:t>71.7%</w:t>
+              <w:t>71.9%</w:t>
             </w:r>
           </w:p>
         </w:tc>
@@ -5824,7 +5824,7 @@
                 <w:rFonts w:ascii="Times New Roman" w:hAnsi="Times New Roman"/>
                 <w:sz w:val="20"/>
               </w:rPr>
-              <w:t>42.0%</w:t>
+              <w:t>42.7%</w:t>
             </w:r>
           </w:p>
         </w:tc>
@@ -5839,7 +5839,7 @@
                 <w:rFonts w:ascii="Times New Roman" w:hAnsi="Times New Roman"/>
                 <w:sz w:val="20"/>
               </w:rPr>
-              <w:t>18.3%</w:t>
+              <w:t>19.2%</w:t>
             </w:r>
           </w:p>
         </w:tc>
@@ -5871,7 +5871,7 @@
                 <w:rFonts w:ascii="Times New Roman" w:hAnsi="Times New Roman"/>
                 <w:sz w:val="20"/>
               </w:rPr>
-              <w:t>0.88 (0.54–1.37)</w:t>
+              <w:t>0.89 (0.53–1.41)</w:t>
             </w:r>
           </w:p>
         </w:tc>
@@ -5886,7 +5886,7 @@
                 <w:rFonts w:ascii="Times New Roman" w:hAnsi="Times New Roman"/>
                 <w:sz w:val="20"/>
               </w:rPr>
-              <w:t>81.0%</w:t>
+              <w:t>79.8%</w:t>
             </w:r>
           </w:p>
         </w:tc>
@@ -5901,7 +5901,7 @@
                 <w:rFonts w:ascii="Times New Roman" w:hAnsi="Times New Roman"/>
                 <w:sz w:val="20"/>
               </w:rPr>
-              <w:t>56.3%</w:t>
+              <w:t>54.7%</w:t>
             </w:r>
           </w:p>
         </w:tc>
@@ -5916,7 +5916,7 @@
                 <w:rFonts w:ascii="Times New Roman" w:hAnsi="Times New Roman"/>
                 <w:sz w:val="20"/>
               </w:rPr>
-              <w:t>25.4%</w:t>
+              <w:t>24.4%</w:t>
             </w:r>
           </w:p>
         </w:tc>
@@ -5948,7 +5948,7 @@
                 <w:rFonts w:ascii="Times New Roman" w:hAnsi="Times New Roman"/>
                 <w:sz w:val="20"/>
               </w:rPr>
-              <w:t>0.86 (0.57–1.26)</w:t>
+              <w:t>0.85 (0.55–1.24)</w:t>
             </w:r>
           </w:p>
         </w:tc>
@@ -5963,7 +5963,7 @@
                 <w:rFonts w:ascii="Times New Roman" w:hAnsi="Times New Roman"/>
                 <w:sz w:val="20"/>
               </w:rPr>
-              <w:t>86.4%</w:t>
+              <w:t>86.5%</w:t>
             </w:r>
           </w:p>
         </w:tc>
@@ -5978,7 +5978,7 @@
                 <w:rFonts w:ascii="Times New Roman" w:hAnsi="Times New Roman"/>
                 <w:sz w:val="20"/>
               </w:rPr>
-              <w:t>65.3%</w:t>
+              <w:t>66.0%</w:t>
             </w:r>
           </w:p>
         </w:tc>
@@ -5993,7 +5993,7 @@
                 <w:rFonts w:ascii="Times New Roman" w:hAnsi="Times New Roman"/>
                 <w:sz w:val="20"/>
               </w:rPr>
-              <w:t>29.9%</w:t>
+              <w:t>31.1%</w:t>
             </w:r>
           </w:p>
         </w:tc>
@@ -6025,7 +6025,7 @@
                 <w:rFonts w:ascii="Times New Roman" w:hAnsi="Times New Roman"/>
                 <w:sz w:val="20"/>
               </w:rPr>
-              <w:t>0.82 (0.60–1.08)</w:t>
+              <w:t>0.82 (0.59–1.10)</w:t>
             </w:r>
           </w:p>
         </w:tc>
@@ -6070,7 +6070,7 @@
                 <w:rFonts w:ascii="Times New Roman" w:hAnsi="Times New Roman"/>
                 <w:sz w:val="20"/>
               </w:rPr>
-              <w:t>40.8%</w:t>
+              <w:t>41.9%</w:t>
             </w:r>
           </w:p>
         </w:tc>
@@ -6102,7 +6102,7 @@
                 <w:rFonts w:ascii="Times New Roman" w:hAnsi="Times New Roman"/>
                 <w:sz w:val="20"/>
               </w:rPr>
-              <w:t>0.80 (0.63–1.01)</w:t>
+              <w:t>0.80 (0.62–1.00)</w:t>
             </w:r>
           </w:p>
         </w:tc>
@@ -6147,7 +6147,7 @@
                 <w:rFonts w:ascii="Times New Roman" w:hAnsi="Times New Roman"/>
                 <w:sz w:val="20"/>
               </w:rPr>
-              <w:t>49.5%</w:t>
+              <w:t>49.7%</w:t>
             </w:r>
           </w:p>
         </w:tc>
@@ -6179,7 +6179,7 @@
                 <w:rFonts w:ascii="Times New Roman" w:hAnsi="Times New Roman"/>
                 <w:sz w:val="20"/>
               </w:rPr>
-              <w:t>0.78 (0.64–0.92)</w:t>
+              <w:t>0.78 (0.64–0.93)</w:t>
             </w:r>
           </w:p>
         </w:tc>
@@ -6194,7 +6194,7 @@
                 <w:rFonts w:ascii="Times New Roman" w:hAnsi="Times New Roman"/>
                 <w:sz w:val="20"/>
               </w:rPr>
-              <w:t>99.4%</w:t>
+              <w:t>99.3%</w:t>
             </w:r>
           </w:p>
         </w:tc>
@@ -6209,7 +6209,7 @@
                 <w:rFonts w:ascii="Times New Roman" w:hAnsi="Times New Roman"/>
                 <w:sz w:val="20"/>
               </w:rPr>
-              <w:t>95.8%</w:t>
+              <w:t>95.7%</w:t>
             </w:r>
           </w:p>
         </w:tc>
@@ -6224,7 +6224,7 @@
                 <w:rFonts w:ascii="Times New Roman" w:hAnsi="Times New Roman"/>
                 <w:sz w:val="20"/>
               </w:rPr>
-              <w:t>64.1%</w:t>
+              <w:t>63.3%</w:t>
             </w:r>
           </w:p>
         </w:tc>
@@ -6238,7 +6238,7 @@
           <w:i w:val="0"/>
           <w:sz w:val="24"/>
         </w:rPr>
-        <w:t>At \alpha = 0 (RCTs only), the posterior probability of any benefit was only 62.7%, and the probability of clinically meaningful benefit (HR &lt; 0.90) was 21.1%. Even modest incorporation of observational evidence (\alpha = 0.3) increased P(HR &lt; 1) to 86.4% and P(HR &lt; 0.90) to 65.3%. The sensitivity analysis (Fig. 5B) shows a monotonic increase in posterior probability of benefit with increasing \alpha, but conclusions remain uncertain across the full range of discounting.</w:t>
+        <w:t>At \alpha = 0 (RCTs only), the posterior probability of any benefit was only 62.9%, and the probability of clinically meaningful benefit (HR &lt; 0.90) was 21.2%. Even modest incorporation of observational evidence (\alpha = 0.3) increased P(HR &lt; 1) to 86.5% and P(HR &lt; 0.90) to 66.0%. The sensitivity analysis (Fig. 5B) shows a monotonic increase in posterior probability of benefit with increasing \alpha, but conclusions remain uncertain across the full range of discounting.</w:t>
       </w:r>
     </w:p>
     <w:p>

</xml_diff>